<commit_message>
docs: drop word count line and reference list from Section 5
The reference list belongs once at the end of the full report, and the
word count is stated for the whole report rather than per section, so
both are removed from the conclusion file. The Dawood (2024) and
Thottoli et al. (2024) in-text citations remain and must be carried into
the report's master reference list.

Co-Authored-By: Claude Opus 5 <noreply@anthropic.com>
Claude-Session: https://claude.ai/code/session_01NwQosoyaqNWdnebu7kLCso
</commit_message>
<xml_diff>
--- a/docs/report/Section5_Conclusion.docx
+++ b/docs/report/Section5_Conclusion.docx
@@ -347,129 +347,6 @@
           <w:szCs w:val="24"/>
         </w:rPr>
         <w:t xml:space="preserve">Both lessons are directly transferable. Future conversational systems developed by this team will begin by identifying which behaviours are non-negotiable and encoding those structurally from the outset, and will treat systematic adversarial testing as a core development activity rather than a final verification step.</w:t>
-      </w:r>
-    </w:p>
-    <w:p>
-      <w:pPr>
-        <w:spacing w:after="320" w:before="320" w:line="360"/>
-        <w:jc w:val="left"/>
-      </w:pPr>
-      <w:r>
-        <w:rPr>
-          <w:rFonts w:ascii="Times New Roman" w:cs="Times New Roman" w:eastAsia="Times New Roman" w:hAnsi="Times New Roman"/>
-          <w:b w:val="false"/>
-          <w:bCs w:val="false"/>
-          <w:i/>
-          <w:iCs/>
-          <w:sz w:val="24"/>
-          <w:szCs w:val="24"/>
-        </w:rPr>
-        <w:t xml:space="preserve">Word count (Section 5): 1164 words</w:t>
-      </w:r>
-    </w:p>
-    <w:p>
-      <w:pPr>
-        <w:pStyle w:val="Heading1"/>
-        <w:spacing w:after="240" w:before="0" w:line="360"/>
-        <w:jc w:val="left"/>
-      </w:pPr>
-      <w:r>
-        <w:rPr>
-          <w:rFonts w:ascii="Times New Roman" w:cs="Times New Roman" w:eastAsia="Times New Roman" w:hAnsi="Times New Roman"/>
-          <w:b/>
-          <w:bCs/>
-          <w:i w:val="false"/>
-          <w:iCs w:val="false"/>
-          <w:sz w:val="24"/>
-          <w:szCs w:val="24"/>
-        </w:rPr>
-        <w:t xml:space="preserve">References</w:t>
-      </w:r>
-    </w:p>
-    <w:p>
-      <w:pPr>
-        <w:spacing w:after="200" w:line="360"/>
-        <w:ind w:left="720" w:hanging="720"/>
-        <w:jc w:val="left"/>
-      </w:pPr>
-      <w:r>
-        <w:rPr>
-          <w:rFonts w:ascii="Times New Roman" w:cs="Times New Roman" w:eastAsia="Times New Roman" w:hAnsi="Times New Roman"/>
-          <w:b w:val="false"/>
-          <w:bCs w:val="false"/>
-          <w:i w:val="false"/>
-          <w:iCs w:val="false"/>
-          <w:sz w:val="24"/>
-          <w:szCs w:val="24"/>
-        </w:rPr>
-        <w:t xml:space="preserve">Dawood, M. (2024). Assessing the effectiveness of chatbots in providing personalized academic advising and support to higher education students: A narrative literature review. </w:t>
-      </w:r>
-      <w:r>
-        <w:rPr>
-          <w:rFonts w:ascii="Times New Roman" w:cs="Times New Roman" w:eastAsia="Times New Roman" w:hAnsi="Times New Roman"/>
-          <w:b w:val="false"/>
-          <w:bCs w:val="false"/>
-          <w:i/>
-          <w:iCs/>
-          <w:sz w:val="24"/>
-          <w:szCs w:val="24"/>
-        </w:rPr>
-        <w:t xml:space="preserve">Studies in Technology Enhanced Learning, 4</w:t>
-      </w:r>
-      <w:r>
-        <w:rPr>
-          <w:rFonts w:ascii="Times New Roman" w:cs="Times New Roman" w:eastAsia="Times New Roman" w:hAnsi="Times New Roman"/>
-          <w:b w:val="false"/>
-          <w:bCs w:val="false"/>
-          <w:i w:val="false"/>
-          <w:iCs w:val="false"/>
-          <w:sz w:val="24"/>
-          <w:szCs w:val="24"/>
-        </w:rPr>
-        <w:t xml:space="preserve">(1). https://doi.org/10.21428/8c225f6e.7140f8f4</w:t>
-      </w:r>
-    </w:p>
-    <w:p>
-      <w:pPr>
-        <w:spacing w:after="200" w:line="360"/>
-        <w:ind w:left="720" w:hanging="720"/>
-        <w:jc w:val="left"/>
-      </w:pPr>
-      <w:r>
-        <w:rPr>
-          <w:rFonts w:ascii="Times New Roman" w:cs="Times New Roman" w:eastAsia="Times New Roman" w:hAnsi="Times New Roman"/>
-          <w:b w:val="false"/>
-          <w:bCs w:val="false"/>
-          <w:i w:val="false"/>
-          <w:iCs w:val="false"/>
-          <w:sz w:val="24"/>
-          <w:szCs w:val="24"/>
-        </w:rPr>
-        <w:t xml:space="preserve">Thottoli, M. M., Alruqaishi, B. H., &amp; Soosaimanickam, A. (2024). Robo academic advisor: Can chatbots and artificial intelligence replace human interaction? </w:t>
-      </w:r>
-      <w:r>
-        <w:rPr>
-          <w:rFonts w:ascii="Times New Roman" w:cs="Times New Roman" w:eastAsia="Times New Roman" w:hAnsi="Times New Roman"/>
-          <w:b w:val="false"/>
-          <w:bCs w:val="false"/>
-          <w:i/>
-          <w:iCs/>
-          <w:sz w:val="24"/>
-          <w:szCs w:val="24"/>
-        </w:rPr>
-        <w:t xml:space="preserve">Contemporary Educational Technology, 16</w:t>
-      </w:r>
-      <w:r>
-        <w:rPr>
-          <w:rFonts w:ascii="Times New Roman" w:cs="Times New Roman" w:eastAsia="Times New Roman" w:hAnsi="Times New Roman"/>
-          <w:b w:val="false"/>
-          <w:bCs w:val="false"/>
-          <w:i w:val="false"/>
-          <w:iCs w:val="false"/>
-          <w:sz w:val="24"/>
-          <w:szCs w:val="24"/>
-        </w:rPr>
-        <w:t xml:space="preserve">(1), ep485. https://doi.org/10.30935/cedtech/13498</w:t>
       </w:r>
     </w:p>
     <w:sectPr>

</xml_diff>